<commit_message>
1.add arm manual; 2.add mm test file;
</commit_message>
<xml_diff>
--- a/app/multi_thread/multi_thread.docx
+++ b/app/multi_thread/multi_thread.docx
@@ -3179,6 +3179,7 @@
         <w:rPr>
           <w:noProof/>
         </w:rPr>
+        <w:lastRenderedPageBreak/>
         <w:drawing>
           <wp:inline distT="0" distB="0" distL="0" distR="2540">
             <wp:extent cx="4254041" cy="2311400"/>
@@ -6679,7 +6680,7 @@
     <w:p>
       <w:pPr>
         <w:rPr>
-          <w:rFonts w:ascii="Georgia" w:hAnsi="Georgia" w:cs="Georgia" w:hint="eastAsia"/>
+          <w:rFonts w:ascii="Georgia" w:hAnsi="Georgia" w:cs="Georgia"/>
         </w:rPr>
       </w:pPr>
       <w:r>
@@ -13233,7 +13234,7 @@
         </w:tabs>
         <w:jc w:val="left"/>
         <w:rPr>
-          <w:rFonts w:ascii="Courier New" w:eastAsia="宋体" w:hAnsi="Courier New" w:cs="Courier New" w:hint="eastAsia"/>
+          <w:rFonts w:ascii="Courier New" w:eastAsia="宋体" w:hAnsi="Courier New" w:cs="Courier New"/>
           <w:color w:val="FDCE93"/>
           <w:sz w:val="24"/>
           <w:szCs w:val="24"/>
@@ -13499,13 +13500,7 @@
         <w:t xml:space="preserve"> 0</w:t>
       </w:r>
     </w:p>
-    <w:p>
-      <w:pPr>
-        <w:rPr>
-          <w:rFonts w:hint="eastAsia"/>
-        </w:rPr>
-      </w:pPr>
-    </w:p>
+    <w:p/>
     <w:p>
       <w:r>
         <w:t>为了实现互斥锁操作，大多数体系结构都提供了</w:t>
@@ -14382,11 +14377,6 @@
     </w:p>
     <w:p/>
     <w:p>
-      <w:pPr>
-        <w:rPr>
-          <w:rFonts w:hint="eastAsia"/>
-        </w:rPr>
-      </w:pPr>
       <w:r>
         <w:t>写程序时应该尽量避免同时获得多个锁，如果一定有必要这么做，则有一个原则：如果所有线程在需要多个锁时都按相同的先后顺序（常见的是按</w:t>
       </w:r>
@@ -30068,7 +30058,6 @@
     <w:p>
       <w:pPr>
         <w:rPr>
-          <w:rFonts w:hint="eastAsia"/>
           <w:bCs/>
         </w:rPr>
       </w:pPr>
@@ -30498,7 +30487,7 @@
           <w:rFonts w:ascii="Segoe UI" w:hAnsi="Segoe UI" w:cs="Segoe UI"/>
           <w:color w:val="212529"/>
         </w:rPr>
-        <w:t>，与线程</w:t>
+        <w:t>，</w:t>
       </w:r>
       <w:r>
         <w:rPr>
@@ -37290,7 +37279,7 @@
         <w:adjustRightInd w:val="0"/>
         <w:jc w:val="left"/>
         <w:rPr>
-          <w:rFonts w:asciiTheme="majorEastAsia" w:eastAsiaTheme="majorEastAsia" w:hAnsiTheme="majorEastAsia" w:cs="寰蒋闆呴粦"/>
+          <w:rFonts w:asciiTheme="majorEastAsia" w:eastAsiaTheme="majorEastAsia" w:hAnsiTheme="majorEastAsia" w:cs="寰蒋闆呴粦" w:hint="eastAsia"/>
           <w:color w:val="000000"/>
           <w:szCs w:val="21"/>
         </w:rPr>
@@ -37417,23 +37406,15 @@
         </w:rPr>
         <w:t>)</w:t>
       </w:r>
+      <w:bookmarkStart w:id="37" w:name="_GoBack"/>
+      <w:bookmarkEnd w:id="37"/>
     </w:p>
     <w:p>
       <w:pPr>
         <w:pStyle w:val="3"/>
         <w:spacing w:beforeAutospacing="0" w:after="120" w:afterAutospacing="0" w:line="504" w:lineRule="atLeast"/>
-        <w:rPr>
-          <w:rFonts w:ascii="Segoe UI" w:hAnsi="Segoe UI" w:cs="Segoe UI"/>
-          <w:color w:val="212529"/>
-        </w:rPr>
-      </w:pPr>
-    </w:p>
-    <w:p>
-      <w:pPr>
-        <w:pStyle w:val="3"/>
-        <w:spacing w:beforeAutospacing="0" w:after="120" w:afterAutospacing="0" w:line="504" w:lineRule="atLeast"/>
-      </w:pPr>
-      <w:bookmarkStart w:id="37" w:name="_Toc65492083"/>
+      </w:pPr>
+      <w:bookmarkStart w:id="38" w:name="_Toc65492083"/>
       <w:r>
         <w:rPr>
           <w:rFonts w:hint="eastAsia"/>
@@ -37452,7 +37433,7 @@
       <w:r>
         <w:t>安全注意事项</w:t>
       </w:r>
-      <w:bookmarkEnd w:id="37"/>
+      <w:bookmarkEnd w:id="38"/>
     </w:p>
     <w:p>
       <w:pPr>
@@ -38008,11 +37989,11 @@
       <w:r>
         <w:br/>
       </w:r>
-      <w:bookmarkStart w:id="38" w:name="_Toc65492084"/>
+      <w:bookmarkStart w:id="39" w:name="_Toc65492084"/>
       <w:r>
         <w:t>3.4 多线程情况下的信号处理</w:t>
       </w:r>
-      <w:bookmarkEnd w:id="38"/>
+      <w:bookmarkEnd w:id="39"/>
     </w:p>
     <w:p>
       <w:pPr>
@@ -44050,7 +44031,7 @@
           <w:szCs w:val="21"/>
         </w:rPr>
       </w:pPr>
-      <w:bookmarkStart w:id="39" w:name="_Toc65492085"/>
+      <w:bookmarkStart w:id="40" w:name="_Toc65492085"/>
       <w:r>
         <w:rPr>
           <w:rFonts w:ascii="Segoe UI" w:hAnsi="Segoe UI" w:cs="Segoe UI"/>
@@ -44093,7 +44074,7 @@
         </w:rPr>
         <w:t>库函数</w:t>
       </w:r>
-      <w:bookmarkEnd w:id="39"/>
+      <w:bookmarkEnd w:id="40"/>
     </w:p>
     <w:p>
       <w:pPr>
@@ -44170,8 +44151,8 @@
       <w:pPr>
         <w:pStyle w:val="2"/>
       </w:pPr>
-      <w:bookmarkStart w:id="40" w:name="_Toc64971246"/>
-      <w:bookmarkStart w:id="41" w:name="_Toc65492086"/>
+      <w:bookmarkStart w:id="41" w:name="_Toc64971246"/>
+      <w:bookmarkStart w:id="42" w:name="_Toc65492086"/>
       <w:r>
         <w:t xml:space="preserve">4. </w:t>
       </w:r>
@@ -44182,15 +44163,15 @@
       <w:r>
         <w:t>栈</w:t>
       </w:r>
-      <w:bookmarkEnd w:id="40"/>
       <w:bookmarkEnd w:id="41"/>
+      <w:bookmarkEnd w:id="42"/>
       <w:proofErr w:type="gramEnd"/>
     </w:p>
     <w:p>
       <w:pPr>
         <w:pStyle w:val="3"/>
       </w:pPr>
-      <w:bookmarkStart w:id="42" w:name="_Toc65492087"/>
+      <w:bookmarkStart w:id="43" w:name="_Toc65492087"/>
       <w:r>
         <w:t>4.1 线程的</w:t>
       </w:r>
@@ -44198,7 +44179,7 @@
       <w:r>
         <w:t>栈</w:t>
       </w:r>
-      <w:bookmarkEnd w:id="42"/>
+      <w:bookmarkEnd w:id="43"/>
       <w:proofErr w:type="gramEnd"/>
     </w:p>
     <w:p>
@@ -47179,7 +47160,7 @@
       <w:pPr>
         <w:pStyle w:val="3"/>
       </w:pPr>
-      <w:bookmarkStart w:id="43" w:name="_Toc65492088"/>
+      <w:bookmarkStart w:id="44" w:name="_Toc65492088"/>
       <w:r>
         <w:rPr>
           <w:rFonts w:hint="eastAsia"/>
@@ -47206,7 +47187,7 @@
         </w:rPr>
         <w:t>Guard page</w:t>
       </w:r>
-      <w:bookmarkEnd w:id="43"/>
+      <w:bookmarkEnd w:id="44"/>
     </w:p>
     <w:p>
       <w:r>
@@ -47642,15 +47623,7 @@
         <w:t>；</w:t>
       </w:r>
     </w:p>
-    <w:p>
-      <w:pPr>
-        <w:rPr>
-          <w:rFonts w:hint="eastAsia"/>
-        </w:rPr>
-      </w:pPr>
-      <w:bookmarkStart w:id="44" w:name="_GoBack"/>
-      <w:bookmarkEnd w:id="44"/>
-    </w:p>
+    <w:p/>
     <w:p/>
     <w:p>
       <w:r>
@@ -58329,7 +58302,7 @@
 </file>
 
 <file path=customXml/itemProps1.xml><?xml version="1.0" encoding="utf-8"?>
-<ds:datastoreItem xmlns:ds="http://schemas.openxmlformats.org/officeDocument/2006/customXml" ds:itemID="{CC63E7F4-4B10-4687-855A-9B61CFAAAFC4}">
+<ds:datastoreItem xmlns:ds="http://schemas.openxmlformats.org/officeDocument/2006/customXml" ds:itemID="{CE022E5B-1AA4-440E-97F6-060D6926E714}">
   <ds:schemaRefs>
     <ds:schemaRef ds:uri="http://schemas.openxmlformats.org/officeDocument/2006/bibliography"/>
   </ds:schemaRefs>

</xml_diff>